<commit_message>
fix: format TVP lab 3 report
</commit_message>
<xml_diff>
--- a/ЛР 3/report.docx
+++ b/ЛР 3/report.docx
@@ -22,16 +22,12 @@
         <w:autoSpaceDN w:val="0"/>
         <w:adjustRightInd w:val="0"/>
         <w:spacing w:before="480" w:after="0"/>
+        <w:ind w:firstLine="0"/>
         <w:jc w:val="center"/>
       </w:pPr>
       <w:r>
-        <w:t xml:space="preserve">КАФЕДРА № </w:t>
-      </w:r>
-      <w:r>
-        <w:t>__</w:t>
-      </w:r>
-      <w:bookmarkStart w:id="0" w:name="_GoBack"/>
-      <w:bookmarkEnd w:id="0"/>
+        <w:t>КАФЕДРА № 43</w:t>
+      </w:r>
     </w:p>
     <w:p>
       <w:pPr>
@@ -180,6 +176,8 @@
           </w:tcPr>
           <w:p>
             <w:pPr>
+              <w:spacing w:before="0" w:after="0" w:line="240" w:lineRule="auto"/>
+              <w:ind w:left="0" w:right="0" w:firstLine="0"/>
               <w:jc w:val="center"/>
             </w:pPr>
             <w:r/>
@@ -379,6 +377,8 @@
           </w:tcPr>
           <w:p>
             <w:pPr>
+              <w:spacing w:before="0" w:after="0" w:line="240" w:lineRule="auto"/>
+              <w:ind w:left="0" w:right="0" w:firstLine="0"/>
               <w:jc w:val="center"/>
             </w:pPr>
             <w:r/>
@@ -407,6 +407,8 @@
           </w:tcPr>
           <w:p>
             <w:pPr>
+              <w:spacing w:before="0" w:after="0" w:line="240" w:lineRule="auto"/>
+              <w:ind w:left="0" w:right="0" w:firstLine="0"/>
               <w:jc w:val="center"/>
             </w:pPr>
             <w:r/>
@@ -437,6 +439,8 @@
           </w:tcPr>
           <w:p>
             <w:pPr>
+              <w:spacing w:before="0" w:after="0" w:line="240" w:lineRule="auto"/>
+              <w:ind w:left="0" w:right="0" w:firstLine="0"/>
               <w:jc w:val="center"/>
             </w:pPr>
             <w:r/>
@@ -537,20 +541,30 @@
               <w:bottom w:val="nil"/>
               <w:right w:val="nil"/>
             </w:tcBorders>
-            <w:vAlign w:val="center"/>
-          </w:tcPr>
-          <w:p>
-            <w:pPr>
-              <w:jc w:val="center"/>
-            </w:pPr>
-            <w:r/>
-            <w:r>
-              <w:rPr>
-                <w:rFonts w:ascii="Times New Roman" w:hAnsi="Times New Roman"/>
-                <w:b w:val="0"/>
-                <w:sz w:val="20"/>
-              </w:rPr>
-              <w:t>Могилатов С. И.</w:t>
+            <w:vAlign w:val="bottom"/>
+          </w:tcPr>
+          <w:p>
+            <w:pPr>
+              <w:widowControl w:val="0"/>
+              <w:autoSpaceDE w:val="0"/>
+              <w:autoSpaceDN w:val="0"/>
+              <w:adjustRightInd w:val="0"/>
+              <w:ind w:left="-108"/>
+            </w:pPr>
+            <w:r>
+              <w:t>СТУДЕНТ</w:t>
+            </w:r>
+            <w:r>
+              <w:t xml:space="preserve"> </w:t>
+            </w:r>
+            <w:r>
+              <w:t>гр</w:t>
+            </w:r>
+            <w:r>
+              <w:t>.</w:t>
+            </w:r>
+            <w:r>
+              <w:t xml:space="preserve"> №</w:t>
             </w:r>
           </w:p>
         </w:tc>
@@ -613,13 +627,19 @@
           </w:tcPr>
           <w:p>
             <w:pPr>
-              <w:widowControl w:val="0"/>
-              <w:autoSpaceDE w:val="0"/>
-              <w:autoSpaceDN w:val="0"/>
-              <w:adjustRightInd w:val="0"/>
-              <w:spacing w:before="120"/>
-              <w:jc w:val="center"/>
-            </w:pPr>
+              <w:spacing w:before="0" w:after="0" w:line="240" w:lineRule="auto"/>
+              <w:ind w:left="0" w:right="0" w:firstLine="0"/>
+              <w:jc w:val="center"/>
+            </w:pPr>
+            <w:r/>
+            <w:r>
+              <w:rPr>
+                <w:rFonts w:ascii="Times New Roman" w:hAnsi="Times New Roman"/>
+                <w:b w:val="0"/>
+                <w:sz w:val="20"/>
+              </w:rPr>
+              <w:t>4332</w:t>
+            </w:r>
           </w:p>
         </w:tc>
         <w:tc>
@@ -657,13 +677,19 @@
           </w:tcPr>
           <w:p>
             <w:pPr>
-              <w:widowControl w:val="0"/>
-              <w:autoSpaceDE w:val="0"/>
-              <w:autoSpaceDN w:val="0"/>
-              <w:adjustRightInd w:val="0"/>
-              <w:spacing w:before="120"/>
-              <w:jc w:val="center"/>
-            </w:pPr>
+              <w:spacing w:before="0" w:after="0" w:line="240" w:lineRule="auto"/>
+              <w:ind w:left="0" w:right="0" w:firstLine="0"/>
+              <w:jc w:val="center"/>
+            </w:pPr>
+            <w:r/>
+            <w:r>
+              <w:rPr>
+                <w:rFonts w:ascii="Times New Roman" w:hAnsi="Times New Roman"/>
+                <w:b w:val="0"/>
+                <w:sz w:val="20"/>
+              </w:rPr>
+              <w:t>Могилатов С. И.</w:t>
+            </w:r>
           </w:p>
         </w:tc>
       </w:tr>
@@ -748,16 +774,23 @@
           </w:tcPr>
           <w:p>
             <w:pPr>
-              <w:jc w:val="center"/>
-            </w:pPr>
-            <w:r/>
-            <w:r>
-              <w:rPr>
-                <w:rFonts w:ascii="Times New Roman" w:hAnsi="Times New Roman"/>
-                <w:b w:val="0"/>
-                <w:sz w:val="20"/>
-              </w:rPr>
-              <w:t>4333К</w:t>
+              <w:widowControl w:val="0"/>
+              <w:autoSpaceDE w:val="0"/>
+              <w:autoSpaceDN w:val="0"/>
+              <w:adjustRightInd w:val="0"/>
+              <w:spacing w:line="180" w:lineRule="exact"/>
+              <w:jc w:val="center"/>
+              <w:rPr>
+                <w:sz w:val="20"/>
+                <w:szCs w:val="20"/>
+              </w:rPr>
+            </w:pPr>
+            <w:r>
+              <w:rPr>
+                <w:sz w:val="20"/>
+                <w:szCs w:val="20"/>
+              </w:rPr>
+              <w:t>подпись, дата</w:t>
             </w:r>
           </w:p>
         </w:tc>
@@ -831,28 +864,91 @@
       </w:pPr>
     </w:p>
     <w:p>
-      <w:pPr>
-        <w:widowControl w:val="0"/>
-        <w:autoSpaceDE w:val="0"/>
-        <w:autoSpaceDN w:val="0"/>
-        <w:adjustRightInd w:val="0"/>
-        <w:spacing w:before="1800" w:after="0"/>
+      <w:r>
+        <w:br w:type="page"/>
+      </w:r>
+    </w:p>
+    <w:p>
+      <w:pPr>
+        <w:pStyle w:val="1"/>
+        <w:pageBreakBefore w:val="0"/>
+        <w:ind w:firstLine="0"/>
         <w:jc w:val="center"/>
-        <w:rPr>
-          <w:lang w:val="en-US"/>
-        </w:rPr>
-      </w:pPr>
-      <w:r>
-        <w:t>Санкт-Петербург</w:t>
-      </w:r>
-      <w:r>
-        <w:rPr>
-          <w:lang w:val="en-US"/>
-        </w:rPr>
-        <w:t xml:space="preserve"> </w:t>
-      </w:r>
-      <w:r>
-        <w:t>20__</w:t>
+      </w:pPr>
+      <w:r>
+        <w:t>СОДЕРЖАНИЕ</w:t>
+      </w:r>
+    </w:p>
+    <w:p>
+      <w:pPr>
+        <w:spacing w:line="240" w:lineRule="auto"/>
+        <w:ind w:left="425" w:firstLine="0"/>
+      </w:pPr>
+      <w:r>
+        <w:t>1. Цель работы ........................................................ 3</w:t>
+      </w:r>
+    </w:p>
+    <w:p>
+      <w:pPr>
+        <w:spacing w:line="240" w:lineRule="auto"/>
+        <w:ind w:left="425" w:firstLine="0"/>
+      </w:pPr>
+      <w:r>
+        <w:t>2. Теоретические сведения ........................................... 4</w:t>
+      </w:r>
+    </w:p>
+    <w:p>
+      <w:pPr>
+        <w:spacing w:line="240" w:lineRule="auto"/>
+        <w:ind w:left="425" w:firstLine="0"/>
+      </w:pPr>
+      <w:r>
+        <w:t>3. Постановка задачи и вариант 20 ................................. 5</w:t>
+      </w:r>
+    </w:p>
+    <w:p>
+      <w:pPr>
+        <w:spacing w:line="240" w:lineRule="auto"/>
+        <w:ind w:left="425" w:firstLine="0"/>
+      </w:pPr>
+      <w:r>
+        <w:t>4. Разработка алгоритма и программы ............................... 6</w:t>
+      </w:r>
+    </w:p>
+    <w:p>
+      <w:pPr>
+        <w:spacing w:line="240" w:lineRule="auto"/>
+        <w:ind w:left="425" w:firstLine="0"/>
+      </w:pPr>
+      <w:r>
+        <w:t>5. Результаты тестирования .......................................... 7</w:t>
+      </w:r>
+    </w:p>
+    <w:p>
+      <w:pPr>
+        <w:spacing w:line="240" w:lineRule="auto"/>
+        <w:ind w:left="425" w:firstLine="0"/>
+      </w:pPr>
+      <w:r>
+        <w:t>6. Вывод ................................................................ 8</w:t>
+      </w:r>
+    </w:p>
+    <w:p>
+      <w:pPr>
+        <w:spacing w:line="240" w:lineRule="auto"/>
+        <w:ind w:left="425" w:firstLine="0"/>
+      </w:pPr>
+      <w:r>
+        <w:t>7. Контрольные вопросы .............................................. 9</w:t>
+      </w:r>
+    </w:p>
+    <w:p>
+      <w:pPr>
+        <w:spacing w:line="240" w:lineRule="auto"/>
+        <w:ind w:left="425" w:firstLine="0"/>
+      </w:pPr>
+      <w:r>
+        <w:t>8. Список использованных источников .............................. 10</w:t>
       </w:r>
     </w:p>
     <w:p>
@@ -863,23 +959,28 @@
     <w:p>
       <w:pPr>
         <w:pStyle w:val="1"/>
+        <w:pageBreakBefore/>
+        <w:ind w:firstLine="0"/>
         <w:jc w:val="left"/>
       </w:pPr>
       <w:r>
-        <w:t>Содержание</w:t>
-      </w:r>
-    </w:p>
-    <w:p>
-      <w:pPr>
-        <w:ind w:left="425"/>
-      </w:pPr>
-      <w:r>
         <w:t>1. Цель работы</w:t>
       </w:r>
     </w:p>
     <w:p>
       <w:pPr>
-        <w:ind w:left="425"/>
+        <w:jc w:val="both"/>
+      </w:pPr>
+      <w:r>
+        <w:t>Цель лабораторной работы — реализовать эмулятор канонической системы Поста, считывающий описание системы из файла, принимающий два аргумента в унарной записи и формирующий пошаговый протокол вывода. Для варианта 20 требуется вычислить функцию f(x,y)=(x+1)(y+1).</w:t>
+      </w:r>
+    </w:p>
+    <w:p>
+      <w:pPr>
+        <w:pStyle w:val="1"/>
+        <w:pageBreakBefore/>
+        <w:ind w:firstLine="0"/>
+        <w:jc w:val="left"/>
       </w:pPr>
       <w:r>
         <w:t>2. Теоретические сведения</w:t>
@@ -887,102 +988,25 @@
     </w:p>
     <w:p>
       <w:pPr>
-        <w:ind w:left="425"/>
-      </w:pPr>
-      <w:r>
-        <w:t>3. Постановка задачи и вариант 20</w:t>
-      </w:r>
-    </w:p>
-    <w:p>
-      <w:pPr>
-        <w:ind w:left="425"/>
-      </w:pPr>
-      <w:r>
-        <w:t>4. Разработка алгоритма и программы</w:t>
-      </w:r>
-    </w:p>
-    <w:p>
-      <w:pPr>
-        <w:ind w:left="425"/>
-      </w:pPr>
-      <w:r>
-        <w:t>5. Результаты тестирования</w:t>
-      </w:r>
-    </w:p>
-    <w:p>
-      <w:pPr>
-        <w:ind w:left="425"/>
-      </w:pPr>
-      <w:r>
-        <w:t>6. Вывод</w:t>
-      </w:r>
-    </w:p>
-    <w:p>
-      <w:pPr>
-        <w:ind w:left="425"/>
-      </w:pPr>
-      <w:r>
-        <w:t>7. Контрольные вопросы</w:t>
-      </w:r>
-    </w:p>
-    <w:p>
-      <w:pPr>
-        <w:ind w:left="425"/>
-      </w:pPr>
-      <w:r>
-        <w:t>8. Список использованных источников</w:t>
-      </w:r>
-    </w:p>
-    <w:p>
-      <w:r>
-        <w:br w:type="page"/>
+        <w:jc w:val="both"/>
+      </w:pPr>
+      <w:r>
+        <w:t>Каноническая система Поста задаётся множествами начальных слов A, переменных X, продукционных правил A1 и обычных правил R. На каждом шаге к текущему слову применяется допустимое правило, после чего фиксируются исходная строка, правило и результат его применения. Унарная запись удобна тем, что число единичных символов непосредственно представляет натуральное число.</w:t>
+      </w:r>
+    </w:p>
+    <w:p>
+      <w:pPr>
+        <w:jc w:val="both"/>
+      </w:pPr>
+      <w:r>
+        <w:t>В программе разделитель '/' отделяет аргументы x и y. Перед запуском проверяются алфавит входа и структура строки. После вычисления результат материализуется как последовательность единиц и сохраняется вместе с протоколом в выходной файл.</w:t>
       </w:r>
     </w:p>
     <w:p>
       <w:pPr>
         <w:pStyle w:val="1"/>
-        <w:jc w:val="left"/>
-      </w:pPr>
-      <w:r>
-        <w:t>1. Цель работы</w:t>
-      </w:r>
-    </w:p>
-    <w:p>
-      <w:pPr>
-        <w:jc w:val="both"/>
-      </w:pPr>
-      <w:r>
-        <w:t>Цель лабораторной работы — реализовать эмулятор канонической системы Поста, считывающий описание системы из файла, принимающий два аргумента в унарной записи и формирующий пошаговый протокол вывода. Для варианта 20 требуется вычислить функцию f(x,y)=(x+1)(y+1).</w:t>
-      </w:r>
-    </w:p>
-    <w:p>
-      <w:pPr>
-        <w:pStyle w:val="1"/>
-        <w:jc w:val="left"/>
-      </w:pPr>
-      <w:r>
-        <w:t>2. Теоретические сведения</w:t>
-      </w:r>
-    </w:p>
-    <w:p>
-      <w:pPr>
-        <w:jc w:val="both"/>
-      </w:pPr>
-      <w:r>
-        <w:t>Каноническая система Поста задаётся множествами начальных слов A, переменных X, продукционных правил A1 и обычных правил R. На каждом шаге к текущему слову применяется допустимое правило, после чего фиксируются исходная строка, правило и результат его применения. Унарная запись удобна тем, что число единичных символов непосредственно представляет натуральное число.</w:t>
-      </w:r>
-    </w:p>
-    <w:p>
-      <w:pPr>
-        <w:jc w:val="both"/>
-      </w:pPr>
-      <w:r>
-        <w:t>В программе разделитель '/' отделяет аргументы x и y. Перед запуском проверяются алфавит входа и структура строки. После вычисления результат материализуется как последовательность единиц и сохраняется вместе с протоколом в выходной файл.</w:t>
-      </w:r>
-    </w:p>
-    <w:p>
-      <w:pPr>
-        <w:pStyle w:val="1"/>
+        <w:pageBreakBefore/>
+        <w:ind w:firstLine="0"/>
         <w:jc w:val="left"/>
       </w:pPr>
       <w:r>
@@ -1006,6 +1030,8 @@
           </w:tcPr>
           <w:p>
             <w:pPr>
+              <w:spacing w:before="0" w:after="0" w:line="240" w:lineRule="auto"/>
+              <w:ind w:left="0" w:right="0" w:firstLine="0"/>
               <w:jc w:val="center"/>
             </w:pPr>
             <w:r/>
@@ -1026,6 +1052,8 @@
           </w:tcPr>
           <w:p>
             <w:pPr>
+              <w:spacing w:before="0" w:after="0" w:line="240" w:lineRule="auto"/>
+              <w:ind w:left="0" w:right="0" w:firstLine="0"/>
               <w:jc w:val="center"/>
             </w:pPr>
             <w:r/>
@@ -1048,6 +1076,8 @@
           </w:tcPr>
           <w:p>
             <w:pPr>
+              <w:spacing w:before="0" w:after="0" w:line="240" w:lineRule="auto"/>
+              <w:ind w:left="0" w:right="0" w:firstLine="0"/>
               <w:jc w:val="center"/>
             </w:pPr>
             <w:r/>
@@ -1068,6 +1098,8 @@
           </w:tcPr>
           <w:p>
             <w:pPr>
+              <w:spacing w:before="0" w:after="0" w:line="240" w:lineRule="auto"/>
+              <w:ind w:left="0" w:right="0" w:firstLine="0"/>
               <w:jc w:val="center"/>
             </w:pPr>
             <w:r/>
@@ -1090,6 +1122,8 @@
           </w:tcPr>
           <w:p>
             <w:pPr>
+              <w:spacing w:before="0" w:after="0" w:line="240" w:lineRule="auto"/>
+              <w:ind w:left="0" w:right="0" w:firstLine="0"/>
               <w:jc w:val="center"/>
             </w:pPr>
             <w:r/>
@@ -1110,6 +1144,8 @@
           </w:tcPr>
           <w:p>
             <w:pPr>
+              <w:spacing w:before="0" w:after="0" w:line="240" w:lineRule="auto"/>
+              <w:ind w:left="0" w:right="0" w:firstLine="0"/>
               <w:jc w:val="center"/>
             </w:pPr>
             <w:r/>
@@ -1132,6 +1168,8 @@
           </w:tcPr>
           <w:p>
             <w:pPr>
+              <w:spacing w:before="0" w:after="0" w:line="240" w:lineRule="auto"/>
+              <w:ind w:left="0" w:right="0" w:firstLine="0"/>
               <w:jc w:val="center"/>
             </w:pPr>
             <w:r/>
@@ -1152,6 +1190,8 @@
           </w:tcPr>
           <w:p>
             <w:pPr>
+              <w:spacing w:before="0" w:after="0" w:line="240" w:lineRule="auto"/>
+              <w:ind w:left="0" w:right="0" w:firstLine="0"/>
               <w:jc w:val="center"/>
             </w:pPr>
             <w:r/>
@@ -1174,6 +1214,8 @@
           </w:tcPr>
           <w:p>
             <w:pPr>
+              <w:spacing w:before="0" w:after="0" w:line="240" w:lineRule="auto"/>
+              <w:ind w:left="0" w:right="0" w:firstLine="0"/>
               <w:jc w:val="center"/>
             </w:pPr>
             <w:r/>
@@ -1194,6 +1236,8 @@
           </w:tcPr>
           <w:p>
             <w:pPr>
+              <w:spacing w:before="0" w:after="0" w:line="240" w:lineRule="auto"/>
+              <w:ind w:left="0" w:right="0" w:firstLine="0"/>
               <w:jc w:val="center"/>
             </w:pPr>
             <w:r/>
@@ -1216,6 +1260,8 @@
           </w:tcPr>
           <w:p>
             <w:pPr>
+              <w:spacing w:before="0" w:after="0" w:line="240" w:lineRule="auto"/>
+              <w:ind w:left="0" w:right="0" w:firstLine="0"/>
               <w:jc w:val="center"/>
             </w:pPr>
             <w:r/>
@@ -1236,6 +1282,8 @@
           </w:tcPr>
           <w:p>
             <w:pPr>
+              <w:spacing w:before="0" w:after="0" w:line="240" w:lineRule="auto"/>
+              <w:ind w:left="0" w:right="0" w:firstLine="0"/>
               <w:jc w:val="center"/>
             </w:pPr>
             <w:r/>
@@ -1258,6 +1306,8 @@
           </w:tcPr>
           <w:p>
             <w:pPr>
+              <w:spacing w:before="0" w:after="0" w:line="240" w:lineRule="auto"/>
+              <w:ind w:left="0" w:right="0" w:firstLine="0"/>
               <w:jc w:val="center"/>
             </w:pPr>
             <w:r/>
@@ -1278,6 +1328,8 @@
           </w:tcPr>
           <w:p>
             <w:pPr>
+              <w:spacing w:before="0" w:after="0" w:line="240" w:lineRule="auto"/>
+              <w:ind w:left="0" w:right="0" w:firstLine="0"/>
               <w:jc w:val="center"/>
             </w:pPr>
             <w:r/>
@@ -1336,7 +1388,7 @@
         <w:pStyle w:val="Code"/>
       </w:pPr>
       <w:r>
-        <w:t xml:space="preserve"># Variables </w:t>
+        <w:t># Variables</w:t>
       </w:r>
     </w:p>
     <w:p>
@@ -1374,7 +1426,7 @@
         <w:pStyle w:val="Code"/>
       </w:pPr>
       <w:r>
-        <w:t xml:space="preserve">y xy </w:t>
+        <w:t>y xy</w:t>
       </w:r>
     </w:p>
     <w:p>
@@ -1388,7 +1440,7 @@
         <w:pStyle w:val="Code"/>
       </w:pPr>
       <w:r>
-        <w:t xml:space="preserve"># Rules  </w:t>
+        <w:t># Rules</w:t>
       </w:r>
     </w:p>
     <w:p>
@@ -1418,6 +1470,8 @@
     <w:p>
       <w:pPr>
         <w:pStyle w:val="1"/>
+        <w:pageBreakBefore/>
+        <w:ind w:firstLine="0"/>
         <w:jc w:val="left"/>
       </w:pPr>
       <w:r>
@@ -1467,6 +1521,8 @@
     <w:p>
       <w:pPr>
         <w:pStyle w:val="1"/>
+        <w:pageBreakBefore/>
+        <w:ind w:firstLine="0"/>
         <w:jc w:val="left"/>
       </w:pPr>
       <w:r>
@@ -1508,7 +1564,7 @@
         <w:pStyle w:val="Code"/>
       </w:pPr>
       <w:r>
-        <w:t xml:space="preserve">Step   Source string   Applied rule         Rule result              </w:t>
+        <w:t>Step   Source string   Applied rule         Rule result</w:t>
       </w:r>
     </w:p>
     <w:p>
@@ -1551,6 +1607,8 @@
           </w:tcPr>
           <w:p>
             <w:pPr>
+              <w:spacing w:before="0" w:after="0" w:line="240" w:lineRule="auto"/>
+              <w:ind w:left="0" w:right="0" w:firstLine="0"/>
               <w:jc w:val="center"/>
             </w:pPr>
             <w:r/>
@@ -1571,6 +1629,8 @@
           </w:tcPr>
           <w:p>
             <w:pPr>
+              <w:spacing w:before="0" w:after="0" w:line="240" w:lineRule="auto"/>
+              <w:ind w:left="0" w:right="0" w:firstLine="0"/>
               <w:jc w:val="center"/>
             </w:pPr>
             <w:r/>
@@ -1591,6 +1651,8 @@
           </w:tcPr>
           <w:p>
             <w:pPr>
+              <w:spacing w:before="0" w:after="0" w:line="240" w:lineRule="auto"/>
+              <w:ind w:left="0" w:right="0" w:firstLine="0"/>
               <w:jc w:val="center"/>
             </w:pPr>
             <w:r/>
@@ -1613,6 +1675,8 @@
           </w:tcPr>
           <w:p>
             <w:pPr>
+              <w:spacing w:before="0" w:after="0" w:line="240" w:lineRule="auto"/>
+              <w:ind w:left="0" w:right="0" w:firstLine="0"/>
               <w:jc w:val="center"/>
             </w:pPr>
             <w:r/>
@@ -1633,6 +1697,8 @@
           </w:tcPr>
           <w:p>
             <w:pPr>
+              <w:spacing w:before="0" w:after="0" w:line="240" w:lineRule="auto"/>
+              <w:ind w:left="0" w:right="0" w:firstLine="0"/>
               <w:jc w:val="center"/>
             </w:pPr>
             <w:r/>
@@ -1653,6 +1719,8 @@
           </w:tcPr>
           <w:p>
             <w:pPr>
+              <w:spacing w:before="0" w:after="0" w:line="240" w:lineRule="auto"/>
+              <w:ind w:left="0" w:right="0" w:firstLine="0"/>
               <w:jc w:val="center"/>
             </w:pPr>
             <w:r/>
@@ -1675,6 +1743,8 @@
           </w:tcPr>
           <w:p>
             <w:pPr>
+              <w:spacing w:before="0" w:after="0" w:line="240" w:lineRule="auto"/>
+              <w:ind w:left="0" w:right="0" w:firstLine="0"/>
               <w:jc w:val="center"/>
             </w:pPr>
             <w:r/>
@@ -1695,6 +1765,8 @@
           </w:tcPr>
           <w:p>
             <w:pPr>
+              <w:spacing w:before="0" w:after="0" w:line="240" w:lineRule="auto"/>
+              <w:ind w:left="0" w:right="0" w:firstLine="0"/>
               <w:jc w:val="center"/>
             </w:pPr>
             <w:r/>
@@ -1715,6 +1787,8 @@
           </w:tcPr>
           <w:p>
             <w:pPr>
+              <w:spacing w:before="0" w:after="0" w:line="240" w:lineRule="auto"/>
+              <w:ind w:left="0" w:right="0" w:firstLine="0"/>
               <w:jc w:val="center"/>
             </w:pPr>
             <w:r/>
@@ -1737,6 +1811,8 @@
           </w:tcPr>
           <w:p>
             <w:pPr>
+              <w:spacing w:before="0" w:after="0" w:line="240" w:lineRule="auto"/>
+              <w:ind w:left="0" w:right="0" w:firstLine="0"/>
               <w:jc w:val="center"/>
             </w:pPr>
             <w:r/>
@@ -1757,6 +1833,8 @@
           </w:tcPr>
           <w:p>
             <w:pPr>
+              <w:spacing w:before="0" w:after="0" w:line="240" w:lineRule="auto"/>
+              <w:ind w:left="0" w:right="0" w:firstLine="0"/>
               <w:jc w:val="center"/>
             </w:pPr>
             <w:r/>
@@ -1777,6 +1855,8 @@
           </w:tcPr>
           <w:p>
             <w:pPr>
+              <w:spacing w:before="0" w:after="0" w:line="240" w:lineRule="auto"/>
+              <w:ind w:left="0" w:right="0" w:firstLine="0"/>
               <w:jc w:val="center"/>
             </w:pPr>
             <w:r/>
@@ -1799,6 +1879,8 @@
           </w:tcPr>
           <w:p>
             <w:pPr>
+              <w:spacing w:before="0" w:after="0" w:line="240" w:lineRule="auto"/>
+              <w:ind w:left="0" w:right="0" w:firstLine="0"/>
               <w:jc w:val="center"/>
             </w:pPr>
             <w:r/>
@@ -1819,6 +1901,8 @@
           </w:tcPr>
           <w:p>
             <w:pPr>
+              <w:spacing w:before="0" w:after="0" w:line="240" w:lineRule="auto"/>
+              <w:ind w:left="0" w:right="0" w:firstLine="0"/>
               <w:jc w:val="center"/>
             </w:pPr>
             <w:r/>
@@ -1839,6 +1923,8 @@
           </w:tcPr>
           <w:p>
             <w:pPr>
+              <w:spacing w:before="0" w:after="0" w:line="240" w:lineRule="auto"/>
+              <w:ind w:left="0" w:right="0" w:firstLine="0"/>
               <w:jc w:val="center"/>
             </w:pPr>
             <w:r/>
@@ -1861,6 +1947,8 @@
           </w:tcPr>
           <w:p>
             <w:pPr>
+              <w:spacing w:before="0" w:after="0" w:line="240" w:lineRule="auto"/>
+              <w:ind w:left="0" w:right="0" w:firstLine="0"/>
               <w:jc w:val="center"/>
             </w:pPr>
             <w:r/>
@@ -1881,6 +1969,8 @@
           </w:tcPr>
           <w:p>
             <w:pPr>
+              <w:spacing w:before="0" w:after="0" w:line="240" w:lineRule="auto"/>
+              <w:ind w:left="0" w:right="0" w:firstLine="0"/>
               <w:jc w:val="center"/>
             </w:pPr>
             <w:r/>
@@ -1901,6 +1991,8 @@
           </w:tcPr>
           <w:p>
             <w:pPr>
+              <w:spacing w:before="0" w:after="0" w:line="240" w:lineRule="auto"/>
+              <w:ind w:left="0" w:right="0" w:firstLine="0"/>
               <w:jc w:val="center"/>
             </w:pPr>
             <w:r/>
@@ -1923,6 +2015,8 @@
           </w:tcPr>
           <w:p>
             <w:pPr>
+              <w:spacing w:before="0" w:after="0" w:line="240" w:lineRule="auto"/>
+              <w:ind w:left="0" w:right="0" w:firstLine="0"/>
               <w:jc w:val="center"/>
             </w:pPr>
             <w:r/>
@@ -1943,6 +2037,8 @@
           </w:tcPr>
           <w:p>
             <w:pPr>
+              <w:spacing w:before="0" w:after="0" w:line="240" w:lineRule="auto"/>
+              <w:ind w:left="0" w:right="0" w:firstLine="0"/>
               <w:jc w:val="center"/>
             </w:pPr>
             <w:r/>
@@ -1963,6 +2059,8 @@
           </w:tcPr>
           <w:p>
             <w:pPr>
+              <w:spacing w:before="0" w:after="0" w:line="240" w:lineRule="auto"/>
+              <w:ind w:left="0" w:right="0" w:firstLine="0"/>
               <w:jc w:val="center"/>
             </w:pPr>
             <w:r/>
@@ -1989,6 +2087,8 @@
     <w:p>
       <w:pPr>
         <w:pStyle w:val="1"/>
+        <w:pageBreakBefore/>
+        <w:ind w:firstLine="0"/>
         <w:jc w:val="left"/>
       </w:pPr>
       <w:r>
@@ -2006,6 +2106,8 @@
     <w:p>
       <w:pPr>
         <w:pStyle w:val="1"/>
+        <w:pageBreakBefore/>
+        <w:ind w:firstLine="0"/>
         <w:jc w:val="left"/>
       </w:pPr>
       <w:r>
@@ -2059,6 +2161,8 @@
     <w:p>
       <w:pPr>
         <w:pStyle w:val="1"/>
+        <w:pageBreakBefore/>
+        <w:ind w:firstLine="0"/>
         <w:jc w:val="left"/>
       </w:pPr>
       <w:r>
@@ -2086,14 +2190,34 @@
       </w:r>
     </w:p>
     <w:sectPr>
+      <w:footerReference w:type="default" r:id="rId6"/>
       <w:type w:val="continuous"/>
       <w:pgSz w:w="11909" w:h="16834"/>
       <w:pgMar w:top="1134" w:right="850" w:bottom="1134" w:left="1701" w:header="720" w:footer="720" w:gutter="0"/>
       <w:cols w:space="720"/>
       <w:noEndnote/>
+      <w:titlePg/>
     </w:sectPr>
   </w:body>
 </w:document>
+</file>
+
+<file path=word/footer1.xml><?xml version="1.0" encoding="utf-8"?>
+<w:ftr xmlns:m="http://schemas.openxmlformats.org/officeDocument/2006/math" xmlns:mc="http://schemas.openxmlformats.org/markup-compatibility/2006" xmlns:mo="http://schemas.microsoft.com/office/mac/office/2008/main" xmlns:mv="urn:schemas-microsoft-com:mac:vml" xmlns:o="urn:schemas-microsoft-com:office:office" xmlns:r="http://schemas.openxmlformats.org/officeDocument/2006/relationships" xmlns:v="urn:schemas-microsoft-com:vml" xmlns:w10="urn:schemas-microsoft-com:office:word" xmlns:w14="http://schemas.microsoft.com/office/word/2010/wordml" xmlns:w="http://schemas.openxmlformats.org/wordprocessingml/2006/main" xmlns:wne="http://schemas.microsoft.com/office/word/2006/wordml" xmlns:wp14="http://schemas.microsoft.com/office/word/2010/wordprocessingDrawing" xmlns:wp="http://schemas.openxmlformats.org/drawingml/2006/wordprocessingDrawing" xmlns:wpc="http://schemas.microsoft.com/office/word/2010/wordprocessingCanvas" xmlns:wpg="http://schemas.microsoft.com/office/word/2010/wordprocessingGroup" xmlns:wpi="http://schemas.microsoft.com/office/word/2010/wordprocessingInk" xmlns:wps="http://schemas.microsoft.com/office/word/2010/wordprocessingShape" mc:Ignorable="w14 wp14">
+  <w:p>
+    <w:pPr>
+      <w:pStyle w:val="Footer"/>
+      <w:ind w:firstLine="0"/>
+      <w:jc w:val="center"/>
+    </w:pPr>
+    <w:r/>
+    <w:r>
+      <w:fldChar w:fldCharType="begin"/>
+      <w:instrText xml:space="preserve"> PAGE </w:instrText>
+      <w:fldChar w:fldCharType="end"/>
+    </w:r>
+  </w:p>
+</w:ftr>
 </file>
 
 <file path=word/styles.xml><?xml version="1.0" encoding="utf-8"?>

</xml_diff>